<commit_message>
doese updated for eidt
</commit_message>
<xml_diff>
--- a/Project Documentation/ImmuniCare_Final_Project_Documentation.docx
+++ b/Project Documentation/ImmuniCare_Final_Project_Documentation.docx
@@ -3955,7 +3955,7 @@
         <w:spacing w:after="100"/>
       </w:pPr>
       <w:r>
-        <w:t>Current UI note: Dose schedule management is available in Admin/vaccine_doses.php from the “Vaccine Doses” menu and is also available inside Admin/vaccines.php under the “Dose schedule management” section.</w:t>
+        <w:t>Current UI note: Dose schedule management is available in Admin/vaccine_doses.php from the “Vaccine Doses” menu and also inside Admin/vaccines.php. Each dose supports numeric order, an editable display label such as Dose 1 or Booster, age, interval, catch-up rule, clinical source/version and Active/Inactive status. The Parent Portal uses the numeric order for eligibility and displays the label.</w:t>
       </w:r>
     </w:p>
     <w:p>
@@ -6732,7 +6732,7 @@
         <w:spacing w:after="40"/>
       </w:pPr>
       <w:r>
-        <w:t>Child Vaccination Management System/setup/database/migrations/001_harden_schema.sql through 007_legacy_karachi_names.sql, including both 003_workflow_integrity.sql and 003_reporting_preferences.sql.</w:t>
+        <w:t>Child Vaccination Management System/setup/database/migrations/001_harden_schema.sql through 009_vaccine_dose_labels.sql, including both 003_workflow_integrity.sql and 003_reporting_preferences.sql.</w:t>
       </w:r>
     </w:p>
     <w:p>
@@ -6784,7 +6784,7 @@
         <w:spacing w:after="100"/>
       </w:pPr>
       <w:r>
-        <w:t>Database table decision: The four unused support tables have now been removed from the clean installer and migrations. Migration 008 removes them from existing databases. The remaining schema supports the current Parent, Hospital, Admin, notification, recovery, API, inventory, audit, contact and reporting workflows. Back up an existing database before applying migration 008.</w:t>
+        <w:t>Database table decision: The four unused support tables have been removed from the clean installer and migrations. Migration 008 removes them from existing databases, and migration 009 adds editable dose display labels such as Booster. The remaining schema supports the current Parent, Hospital, Admin, notification, recovery, API, inventory, audit, contact and reporting workflows. Back up an existing database before applying migrations 008 and 009.</w:t>
       </w:r>
     </w:p>
     <w:sectPr>

</xml_diff>